<commit_message>
Update compact manuscript and supplement
</commit_message>
<xml_diff>
--- a/manuscript/Supplementary_Material.docx
+++ b/manuscript/Supplementary_Material.docx
@@ -6560,6 +6560,439 @@
       <w:pPr>
         <w:spacing w:after="80" w:line="240" w:lineRule="auto"/>
       </w:pPr>
+    </w:p>
+    <w:p>
+      <w:r>
+        <w:br w:type="page"/>
+      </w:r>
+    </w:p>
+    <w:p>
+      <w:pPr>
+        <w:pStyle w:val="Heading1"/>
+      </w:pPr>
+      <w:r>
+        <w:t>Readability rebalance for the compact main manuscript</w:t>
+      </w:r>
+    </w:p>
+    <w:p>
+      <w:r>
+        <w:t>The main manuscript was reduced to 28 Word-computed pages. Detailed audit tables and secondary plots were moved out of the narrative path so that the article reads as a short causal argument while preserving the full evidence trail in this supplement and the reproducibility repository.</w:t>
+      </w:r>
+    </w:p>
+    <w:p>
+      <w:pPr>
+        <w:pStyle w:val="Heading2"/>
+      </w:pPr>
+      <w:r>
+        <w:t>Material moved out of the main text</w:t>
+      </w:r>
+    </w:p>
+    <w:tbl>
+      <w:tblPr>
+        <w:tblW w:type="auto" w:w="0"/>
+        <w:tblLook w:firstColumn="1" w:firstRow="1" w:lastColumn="0" w:lastRow="0" w:noHBand="0" w:noVBand="1" w:val="04A0"/>
+      </w:tblPr>
+      <w:tblGrid>
+        <w:gridCol w:w="2581"/>
+        <w:gridCol w:w="2581"/>
+        <w:gridCol w:w="2581"/>
+        <w:gridCol w:w="2581"/>
+      </w:tblGrid>
+      <w:tr>
+        <w:tc>
+          <w:tcPr>
+            <w:tcW w:type="dxa" w:w="2581"/>
+          </w:tcPr>
+          <w:p>
+            <w:r>
+              <w:rPr>
+                <w:b/>
+                <w:sz w:val="16"/>
+              </w:rPr>
+              <w:t>Moved item</w:t>
+            </w:r>
+          </w:p>
+        </w:tc>
+        <w:tc>
+          <w:tcPr>
+            <w:tcW w:type="dxa" w:w="2581"/>
+          </w:tcPr>
+          <w:p>
+            <w:r>
+              <w:rPr>
+                <w:b/>
+                <w:sz w:val="16"/>
+              </w:rPr>
+              <w:t>Why moved</w:t>
+            </w:r>
+          </w:p>
+        </w:tc>
+        <w:tc>
+          <w:tcPr>
+            <w:tcW w:type="dxa" w:w="2581"/>
+          </w:tcPr>
+          <w:p>
+            <w:r>
+              <w:rPr>
+                <w:b/>
+                <w:sz w:val="16"/>
+              </w:rPr>
+              <w:t>Where preserved</w:t>
+            </w:r>
+          </w:p>
+        </w:tc>
+        <w:tc>
+          <w:tcPr>
+            <w:tcW w:type="dxa" w:w="2581"/>
+          </w:tcPr>
+          <w:p>
+            <w:r>
+              <w:rPr>
+                <w:b/>
+                <w:sz w:val="16"/>
+              </w:rPr>
+              <w:t>Reader use</w:t>
+            </w:r>
+          </w:p>
+        </w:tc>
+      </w:tr>
+      <w:tr>
+        <w:tc>
+          <w:tcPr>
+            <w:tcW w:type="dxa" w:w="2581"/>
+          </w:tcPr>
+          <w:p>
+            <w:r>
+              <w:rPr>
+                <w:sz w:val="16"/>
+              </w:rPr>
+              <w:t>Literature-positioning matrix</w:t>
+            </w:r>
+          </w:p>
+        </w:tc>
+        <w:tc>
+          <w:tcPr>
+            <w:tcW w:type="dxa" w:w="2581"/>
+          </w:tcPr>
+          <w:p>
+            <w:r>
+              <w:rPr>
+                <w:sz w:val="16"/>
+              </w:rPr>
+              <w:t>Long comparison table interrupted the introduction</w:t>
+            </w:r>
+          </w:p>
+        </w:tc>
+        <w:tc>
+          <w:tcPr>
+            <w:tcW w:type="dxa" w:w="2581"/>
+          </w:tcPr>
+          <w:p>
+            <w:r>
+              <w:rPr>
+                <w:sz w:val="16"/>
+              </w:rPr>
+              <w:t>README, manuscript source history, supplement roadmap</w:t>
+            </w:r>
+          </w:p>
+        </w:tc>
+        <w:tc>
+          <w:tcPr>
+            <w:tcW w:type="dxa" w:w="2581"/>
+          </w:tcPr>
+          <w:p>
+            <w:r>
+              <w:rPr>
+                <w:sz w:val="16"/>
+              </w:rPr>
+              <w:t>Check novelty positioning without slowing the main argument</w:t>
+            </w:r>
+          </w:p>
+        </w:tc>
+      </w:tr>
+      <w:tr>
+        <w:tc>
+          <w:tcPr>
+            <w:tcW w:type="dxa" w:w="2581"/>
+          </w:tcPr>
+          <w:p>
+            <w:r>
+              <w:rPr>
+                <w:sz w:val="16"/>
+              </w:rPr>
+              <w:t>Random variables, layer profile and scenario tables</w:t>
+            </w:r>
+          </w:p>
+        </w:tc>
+        <w:tc>
+          <w:tcPr>
+            <w:tcW w:type="dxa" w:w="2581"/>
+          </w:tcPr>
+          <w:p>
+            <w:r>
+              <w:rPr>
+                <w:sz w:val="16"/>
+              </w:rPr>
+              <w:t>Input details are reproducibility material</w:t>
+            </w:r>
+          </w:p>
+        </w:tc>
+        <w:tc>
+          <w:tcPr>
+            <w:tcW w:type="dxa" w:w="2581"/>
+          </w:tcPr>
+          <w:p>
+            <w:r>
+              <w:rPr>
+                <w:sz w:val="16"/>
+              </w:rPr>
+              <w:t>data/*.csv and scripts/run_118_nonstationary_liquefaction_benchmark.py</w:t>
+            </w:r>
+          </w:p>
+        </w:tc>
+        <w:tc>
+          <w:tcPr>
+            <w:tcW w:type="dxa" w:w="2581"/>
+          </w:tcPr>
+          <w:p>
+            <w:r>
+              <w:rPr>
+                <w:sz w:val="16"/>
+              </w:rPr>
+              <w:t>Reproduce the benchmark inputs</w:t>
+            </w:r>
+          </w:p>
+        </w:tc>
+      </w:tr>
+      <w:tr>
+        <w:tc>
+          <w:tcPr>
+            <w:tcW w:type="dxa" w:w="2581"/>
+          </w:tcPr>
+          <w:p>
+            <w:r>
+              <w:rPr>
+                <w:sz w:val="16"/>
+              </w:rPr>
+              <w:t>Monte Carlo convergence and sensitivity tables</w:t>
+            </w:r>
+          </w:p>
+        </w:tc>
+        <w:tc>
+          <w:tcPr>
+            <w:tcW w:type="dxa" w:w="2581"/>
+          </w:tcPr>
+          <w:p>
+            <w:r>
+              <w:rPr>
+                <w:sz w:val="16"/>
+              </w:rPr>
+              <w:t>Audit details rather than main claim</w:t>
+            </w:r>
+          </w:p>
+        </w:tc>
+        <w:tc>
+          <w:tcPr>
+            <w:tcW w:type="dxa" w:w="2581"/>
+          </w:tcPr>
+          <w:p>
+            <w:r>
+              <w:rPr>
+                <w:sz w:val="16"/>
+              </w:rPr>
+              <w:t>outputs and data convergence/sensitivity CSV files</w:t>
+            </w:r>
+          </w:p>
+        </w:tc>
+        <w:tc>
+          <w:tcPr>
+            <w:tcW w:type="dxa" w:w="2581"/>
+          </w:tcPr>
+          <w:p>
+            <w:r>
+              <w:rPr>
+                <w:sz w:val="16"/>
+              </w:rPr>
+              <w:t>Verify numerical stability</w:t>
+            </w:r>
+          </w:p>
+        </w:tc>
+      </w:tr>
+      <w:tr>
+        <w:tc>
+          <w:tcPr>
+            <w:tcW w:type="dxa" w:w="2581"/>
+          </w:tcPr>
+          <w:p>
+            <w:r>
+              <w:rPr>
+                <w:sz w:val="16"/>
+              </w:rPr>
+              <w:t>Hu/Wenchuan detailed external metrics</w:t>
+            </w:r>
+          </w:p>
+        </w:tc>
+        <w:tc>
+          <w:tcPr>
+            <w:tcW w:type="dxa" w:w="2581"/>
+          </w:tcPr>
+          <w:p>
+            <w:r>
+              <w:rPr>
+                <w:sz w:val="16"/>
+              </w:rPr>
+              <w:t>Detailed compatibility evidence</w:t>
+            </w:r>
+          </w:p>
+        </w:tc>
+        <w:tc>
+          <w:tcPr>
+            <w:tcW w:type="dxa" w:w="2581"/>
+          </w:tcPr>
+          <w:p>
+            <w:r>
+              <w:rPr>
+                <w:sz w:val="16"/>
+              </w:rPr>
+              <w:t>outputs/hu_* and data/external_* files</w:t>
+            </w:r>
+          </w:p>
+        </w:tc>
+        <w:tc>
+          <w:tcPr>
+            <w:tcW w:type="dxa" w:w="2581"/>
+          </w:tcPr>
+          <w:p>
+            <w:r>
+              <w:rPr>
+                <w:sz w:val="16"/>
+              </w:rPr>
+              <w:t>Audit external case-history support</w:t>
+            </w:r>
+          </w:p>
+        </w:tc>
+      </w:tr>
+      <w:tr>
+        <w:tc>
+          <w:tcPr>
+            <w:tcW w:type="dxa" w:w="2581"/>
+          </w:tcPr>
+          <w:p>
+            <w:r>
+              <w:rPr>
+                <w:sz w:val="16"/>
+              </w:rPr>
+              <w:t>Secondary site-extension figures</w:t>
+            </w:r>
+          </w:p>
+        </w:tc>
+        <w:tc>
+          <w:tcPr>
+            <w:tcW w:type="dxa" w:w="2581"/>
+          </w:tcPr>
+          <w:p>
+            <w:r>
+              <w:rPr>
+                <w:sz w:val="16"/>
+              </w:rPr>
+              <w:t>Useful but visually heavy in main text</w:t>
+            </w:r>
+          </w:p>
+        </w:tc>
+        <w:tc>
+          <w:tcPr>
+            <w:tcW w:type="dxa" w:w="2581"/>
+          </w:tcPr>
+          <w:p>
+            <w:r>
+              <w:rPr>
+                <w:sz w:val="16"/>
+              </w:rPr>
+              <w:t>figures/fig06-fig11 and validation scripts</w:t>
+            </w:r>
+          </w:p>
+        </w:tc>
+        <w:tc>
+          <w:tcPr>
+            <w:tcW w:type="dxa" w:w="2581"/>
+          </w:tcPr>
+          <w:p>
+            <w:r>
+              <w:rPr>
+                <w:sz w:val="16"/>
+              </w:rPr>
+              <w:t>Inspect Nisqually/Canterbury diagnostics</w:t>
+            </w:r>
+          </w:p>
+        </w:tc>
+      </w:tr>
+      <w:tr>
+        <w:tc>
+          <w:tcPr>
+            <w:tcW w:type="dxa" w:w="2581"/>
+          </w:tcPr>
+          <w:p>
+            <w:r>
+              <w:rPr>
+                <w:sz w:val="16"/>
+              </w:rPr>
+              <w:t>Claim matrix and locked-threshold detailed tables</w:t>
+            </w:r>
+          </w:p>
+        </w:tc>
+        <w:tc>
+          <w:tcPr>
+            <w:tcW w:type="dxa" w:w="2581"/>
+          </w:tcPr>
+          <w:p>
+            <w:r>
+              <w:rPr>
+                <w:sz w:val="16"/>
+              </w:rPr>
+              <w:t>Important but redundant after prose and reader figures</w:t>
+            </w:r>
+          </w:p>
+        </w:tc>
+        <w:tc>
+          <w:tcPr>
+            <w:tcW w:type="dxa" w:w="2581"/>
+          </w:tcPr>
+          <w:p>
+            <w:r>
+              <w:rPr>
+                <w:sz w:val="16"/>
+              </w:rPr>
+              <w:t>MRNB score audit and run_124/run_125 outputs</w:t>
+            </w:r>
+          </w:p>
+        </w:tc>
+        <w:tc>
+          <w:tcPr>
+            <w:tcW w:type="dxa" w:w="2581"/>
+          </w:tcPr>
+          <w:p>
+            <w:r>
+              <w:rPr>
+                <w:sz w:val="16"/>
+              </w:rPr>
+              <w:t>Check claim boundary and decision rules</w:t>
+            </w:r>
+          </w:p>
+        </w:tc>
+      </w:tr>
+    </w:tbl>
+    <w:p>
+      <w:pPr>
+        <w:pStyle w:val="Heading2"/>
+      </w:pPr>
+      <w:r>
+        <w:t>Compact-main invariant</w:t>
+      </w:r>
+    </w:p>
+    <w:p>
+      <w:r>
+        <w:t>The compact main manuscript keeps the title, abstract novelty statement, equations, 54 references, three reader-facing figures, the Canterbury temporal holdout table and the essential claim boundary. The supplement and repository preserve the removed details for technical review.</w:t>
+      </w:r>
     </w:p>
     <w:sectPr>
       <w:pgSz w:w="11909" w:h="16834"/>

</xml_diff>

<commit_message>
Add Canterbury severity triage validation
</commit_message>
<xml_diff>
--- a/manuscript/Supplementary_Material.docx
+++ b/manuscript/Supplementary_Material.docx
@@ -6992,6 +6992,423 @@
     <w:p>
       <w:r>
         <w:t>The compact main manuscript keeps the title, abstract novelty statement, equations, 54 references, three reader-facing figures, the Canterbury temporal holdout table and the essential claim boundary. The supplement and repository preserve the removed details for technical review.</w:t>
+      </w:r>
+    </w:p>
+    <w:p>
+      <w:r>
+        <w:br w:type="page"/>
+      </w:r>
+    </w:p>
+    <w:p>
+      <w:pPr>
+        <w:pStyle w:val="Heading1"/>
+      </w:pPr>
+      <w:r>
+        <w:t>Canterbury severity-triage action proxy</w:t>
+      </w:r>
+    </w:p>
+    <w:p>
+      <w:r>
+        <w:t>This additional validation tests a decision-style question rather than another probability score. Observed severe manifestation is defined as manifestation_code &gt;= 3. For each held-out Canterbury event, each model ranks event states by predicted probability, and the top 10% and top 20% are treated as an inspection or prioritisation set.</w:t>
+      </w:r>
+    </w:p>
+    <w:tbl>
+      <w:tblPr>
+        <w:tblW w:type="auto" w:w="0"/>
+        <w:tblLook w:firstColumn="1" w:firstRow="1" w:lastColumn="0" w:lastRow="0" w:noHBand="0" w:noVBand="1" w:val="04A0"/>
+      </w:tblPr>
+      <w:tblGrid>
+        <w:gridCol w:w="1475"/>
+        <w:gridCol w:w="1475"/>
+        <w:gridCol w:w="1475"/>
+        <w:gridCol w:w="1475"/>
+        <w:gridCol w:w="1475"/>
+        <w:gridCol w:w="1475"/>
+        <w:gridCol w:w="1475"/>
+      </w:tblGrid>
+      <w:tr>
+        <w:tc>
+          <w:tcPr>
+            <w:tcW w:type="dxa" w:w="1475"/>
+          </w:tcPr>
+          <w:p>
+            <w:r>
+              <w:rPr>
+                <w:b/>
+                <w:sz w:val="16"/>
+              </w:rPr>
+              <w:t>Held-out event</w:t>
+            </w:r>
+          </w:p>
+        </w:tc>
+        <w:tc>
+          <w:tcPr>
+            <w:tcW w:type="dxa" w:w="1475"/>
+          </w:tcPr>
+          <w:p>
+            <w:r>
+              <w:rPr>
+                <w:b/>
+                <w:sz w:val="16"/>
+              </w:rPr>
+              <w:t>Model comparison</w:t>
+            </w:r>
+          </w:p>
+        </w:tc>
+        <w:tc>
+          <w:tcPr>
+            <w:tcW w:type="dxa" w:w="1475"/>
+          </w:tcPr>
+          <w:p>
+            <w:r>
+              <w:rPr>
+                <w:b/>
+                <w:sz w:val="16"/>
+              </w:rPr>
+              <w:t>Top fraction</w:t>
+            </w:r>
+          </w:p>
+        </w:tc>
+        <w:tc>
+          <w:tcPr>
+            <w:tcW w:type="dxa" w:w="1475"/>
+          </w:tcPr>
+          <w:p>
+            <w:r>
+              <w:rPr>
+                <w:b/>
+                <w:sz w:val="16"/>
+              </w:rPr>
+              <w:t>M0 severe capture</w:t>
+            </w:r>
+          </w:p>
+        </w:tc>
+        <w:tc>
+          <w:tcPr>
+            <w:tcW w:type="dxa" w:w="1475"/>
+          </w:tcPr>
+          <w:p>
+            <w:r>
+              <w:rPr>
+                <w:b/>
+                <w:sz w:val="16"/>
+              </w:rPr>
+              <w:t>Non-stationary severe capture</w:t>
+            </w:r>
+          </w:p>
+        </w:tc>
+        <w:tc>
+          <w:tcPr>
+            <w:tcW w:type="dxa" w:w="1475"/>
+          </w:tcPr>
+          <w:p>
+            <w:r>
+              <w:rPr>
+                <w:b/>
+                <w:sz w:val="16"/>
+              </w:rPr>
+              <w:t>Severe cases</w:t>
+            </w:r>
+          </w:p>
+        </w:tc>
+        <w:tc>
+          <w:tcPr>
+            <w:tcW w:type="dxa" w:w="1475"/>
+          </w:tcPr>
+          <w:p>
+            <w:r>
+              <w:rPr>
+                <w:b/>
+                <w:sz w:val="16"/>
+              </w:rPr>
+              <w:t>Claim boundary</w:t>
+            </w:r>
+          </w:p>
+        </w:tc>
+      </w:tr>
+      <w:tr>
+        <w:tc>
+          <w:tcPr>
+            <w:tcW w:type="dxa" w:w="1475"/>
+          </w:tcPr>
+          <w:p>
+            <w:r>
+              <w:rPr>
+                <w:sz w:val="16"/>
+              </w:rPr>
+              <w:t>2010 Darfield</w:t>
+            </w:r>
+          </w:p>
+        </w:tc>
+        <w:tc>
+          <w:tcPr>
+            <w:tcW w:type="dxa" w:w="1475"/>
+          </w:tcPr>
+          <w:p>
+            <w:r>
+              <w:rPr>
+                <w:sz w:val="16"/>
+              </w:rPr>
+              <w:t>M2 vs M0</w:t>
+            </w:r>
+          </w:p>
+        </w:tc>
+        <w:tc>
+          <w:tcPr>
+            <w:tcW w:type="dxa" w:w="1475"/>
+          </w:tcPr>
+          <w:p>
+            <w:r>
+              <w:rPr>
+                <w:sz w:val="16"/>
+              </w:rPr>
+              <w:t>20%</w:t>
+            </w:r>
+          </w:p>
+        </w:tc>
+        <w:tc>
+          <w:tcPr>
+            <w:tcW w:type="dxa" w:w="1475"/>
+          </w:tcPr>
+          <w:p>
+            <w:r>
+              <w:rPr>
+                <w:sz w:val="16"/>
+              </w:rPr>
+              <w:t>0.110</w:t>
+            </w:r>
+          </w:p>
+        </w:tc>
+        <w:tc>
+          <w:tcPr>
+            <w:tcW w:type="dxa" w:w="1475"/>
+          </w:tcPr>
+          <w:p>
+            <w:r>
+              <w:rPr>
+                <w:sz w:val="16"/>
+              </w:rPr>
+              <w:t>0.194</w:t>
+            </w:r>
+          </w:p>
+        </w:tc>
+        <w:tc>
+          <w:tcPr>
+            <w:tcW w:type="dxa" w:w="1475"/>
+          </w:tcPr>
+          <w:p>
+            <w:r>
+              <w:rPr>
+                <w:sz w:val="16"/>
+              </w:rPr>
+              <w:t>237</w:t>
+            </w:r>
+          </w:p>
+        </w:tc>
+        <w:tc>
+          <w:tcPr>
+            <w:tcW w:type="dxa" w:w="1475"/>
+          </w:tcPr>
+          <w:p>
+            <w:r>
+              <w:rPr>
+                <w:sz w:val="16"/>
+              </w:rPr>
+              <w:t>Action-style triage support, not repair-cost validation</w:t>
+            </w:r>
+          </w:p>
+        </w:tc>
+      </w:tr>
+      <w:tr>
+        <w:tc>
+          <w:tcPr>
+            <w:tcW w:type="dxa" w:w="1475"/>
+          </w:tcPr>
+          <w:p>
+            <w:r>
+              <w:rPr>
+                <w:sz w:val="16"/>
+              </w:rPr>
+              <w:t>2011 Christchurch</w:t>
+            </w:r>
+          </w:p>
+        </w:tc>
+        <w:tc>
+          <w:tcPr>
+            <w:tcW w:type="dxa" w:w="1475"/>
+          </w:tcPr>
+          <w:p>
+            <w:r>
+              <w:rPr>
+                <w:sz w:val="16"/>
+              </w:rPr>
+              <w:t>M2 vs M0</w:t>
+            </w:r>
+          </w:p>
+        </w:tc>
+        <w:tc>
+          <w:tcPr>
+            <w:tcW w:type="dxa" w:w="1475"/>
+          </w:tcPr>
+          <w:p>
+            <w:r>
+              <w:rPr>
+                <w:sz w:val="16"/>
+              </w:rPr>
+              <w:t>20%</w:t>
+            </w:r>
+          </w:p>
+        </w:tc>
+        <w:tc>
+          <w:tcPr>
+            <w:tcW w:type="dxa" w:w="1475"/>
+          </w:tcPr>
+          <w:p>
+            <w:r>
+              <w:rPr>
+                <w:sz w:val="16"/>
+              </w:rPr>
+              <w:t>0.185</w:t>
+            </w:r>
+          </w:p>
+        </w:tc>
+        <w:tc>
+          <w:tcPr>
+            <w:tcW w:type="dxa" w:w="1475"/>
+          </w:tcPr>
+          <w:p>
+            <w:r>
+              <w:rPr>
+                <w:sz w:val="16"/>
+              </w:rPr>
+              <w:t>0.204</w:t>
+            </w:r>
+          </w:p>
+        </w:tc>
+        <w:tc>
+          <w:tcPr>
+            <w:tcW w:type="dxa" w:w="1475"/>
+          </w:tcPr>
+          <w:p>
+            <w:r>
+              <w:rPr>
+                <w:sz w:val="16"/>
+              </w:rPr>
+              <w:t>1311</w:t>
+            </w:r>
+          </w:p>
+        </w:tc>
+        <w:tc>
+          <w:tcPr>
+            <w:tcW w:type="dxa" w:w="1475"/>
+          </w:tcPr>
+          <w:p>
+            <w:r>
+              <w:rPr>
+                <w:sz w:val="16"/>
+              </w:rPr>
+              <w:t>Action-style triage support, not universal severity prediction</w:t>
+            </w:r>
+          </w:p>
+        </w:tc>
+      </w:tr>
+      <w:tr>
+        <w:tc>
+          <w:tcPr>
+            <w:tcW w:type="dxa" w:w="1475"/>
+          </w:tcPr>
+          <w:p>
+            <w:r>
+              <w:rPr>
+                <w:sz w:val="16"/>
+              </w:rPr>
+              <w:t>2016 Valentine</w:t>
+            </w:r>
+          </w:p>
+        </w:tc>
+        <w:tc>
+          <w:tcPr>
+            <w:tcW w:type="dxa" w:w="1475"/>
+          </w:tcPr>
+          <w:p>
+            <w:r>
+              <w:rPr>
+                <w:sz w:val="16"/>
+              </w:rPr>
+              <w:t>No severe cases</w:t>
+            </w:r>
+          </w:p>
+        </w:tc>
+        <w:tc>
+          <w:tcPr>
+            <w:tcW w:type="dxa" w:w="1475"/>
+          </w:tcPr>
+          <w:p>
+            <w:r>
+              <w:rPr>
+                <w:sz w:val="16"/>
+              </w:rPr>
+              <w:t>20%</w:t>
+            </w:r>
+          </w:p>
+        </w:tc>
+        <w:tc>
+          <w:tcPr>
+            <w:tcW w:type="dxa" w:w="1475"/>
+          </w:tcPr>
+          <w:p>
+            <w:r>
+              <w:rPr>
+                <w:sz w:val="16"/>
+              </w:rPr>
+              <w:t>NA</w:t>
+            </w:r>
+          </w:p>
+        </w:tc>
+        <w:tc>
+          <w:tcPr>
+            <w:tcW w:type="dxa" w:w="1475"/>
+          </w:tcPr>
+          <w:p>
+            <w:r>
+              <w:rPr>
+                <w:sz w:val="16"/>
+              </w:rPr>
+              <w:t>NA</w:t>
+            </w:r>
+          </w:p>
+        </w:tc>
+        <w:tc>
+          <w:tcPr>
+            <w:tcW w:type="dxa" w:w="1475"/>
+          </w:tcPr>
+          <w:p>
+            <w:r>
+              <w:rPr>
+                <w:sz w:val="16"/>
+              </w:rPr>
+              <w:t>0</w:t>
+            </w:r>
+          </w:p>
+        </w:tc>
+        <w:tc>
+          <w:tcPr>
+            <w:tcW w:type="dxa" w:w="1475"/>
+          </w:tcPr>
+          <w:p>
+            <w:r>
+              <w:rPr>
+                <w:sz w:val="16"/>
+              </w:rPr>
+              <w:t>Severity claim blocked for this event</w:t>
+            </w:r>
+          </w:p>
+        </w:tc>
+      </w:tr>
+    </w:tbl>
+    <w:p>
+      <w:r>
+        <w:t>The result supports a bounded action proxy: groundwater/gradation-aware ranking can improve capture of severe manifestation states in the limited inspection set for events where severe manifestations exist. It does not validate repair cost, downtime, design consequence, or a universal severity model.</w:t>
       </w:r>
     </w:p>
     <w:sectPr>

</xml_diff>

<commit_message>
Add repair cost ratio plausibility gate
</commit_message>
<xml_diff>
--- a/manuscript/Supplementary_Material.docx
+++ b/manuscript/Supplementary_Material.docx
@@ -7409,6 +7409,449 @@
     <w:p>
       <w:r>
         <w:t>The result supports a bounded action proxy: groundwater/gradation-aware ranking can improve capture of severe manifestation states in the limited inspection set for events where severe manifestations exist. It does not validate repair cost, downtime, design consequence, or a universal severity model.</w:t>
+      </w:r>
+    </w:p>
+    <w:p>
+      <w:r>
+        <w:br w:type="page"/>
+      </w:r>
+    </w:p>
+    <w:p>
+      <w:pPr>
+        <w:pStyle w:val="Heading1"/>
+      </w:pPr>
+      <w:r>
+        <w:t>DesignSafe PRJ-3126 repair-cost ratio plausibility gate</w:t>
+      </w:r>
+    </w:p>
+    <w:p>
+      <w:r>
+        <w:t>DesignSafe PRJ-3126 was inspected as a possible consequence dataset. The master repair-cost table contains New Zealand earthquake-damaged building component repair costs and times, but it has no shared CPT, event, coordinate or manifestation key that can be joined directly to the Canterbury CPT case histories. It is therefore used only as a plausibility gate for the false-negative cost ratios, not as direct consequence validation.</w:t>
+      </w:r>
+    </w:p>
+    <w:tbl>
+      <w:tblPr>
+        <w:tblW w:type="auto" w:w="0"/>
+        <w:tblLook w:firstColumn="1" w:firstRow="1" w:lastColumn="0" w:lastRow="0" w:noHBand="0" w:noVBand="1" w:val="04A0"/>
+      </w:tblPr>
+      <w:tblGrid>
+        <w:gridCol w:w="1721"/>
+        <w:gridCol w:w="1721"/>
+        <w:gridCol w:w="1721"/>
+        <w:gridCol w:w="1721"/>
+        <w:gridCol w:w="1721"/>
+        <w:gridCol w:w="1721"/>
+      </w:tblGrid>
+      <w:tr>
+        <w:tc>
+          <w:tcPr>
+            <w:tcW w:type="dxa" w:w="1721"/>
+          </w:tcPr>
+          <w:p>
+            <w:r>
+              <w:rPr>
+                <w:b/>
+                <w:sz w:val="16"/>
+              </w:rPr>
+              <w:t>Ratio</w:t>
+            </w:r>
+          </w:p>
+        </w:tc>
+        <w:tc>
+          <w:tcPr>
+            <w:tcW w:type="dxa" w:w="1721"/>
+          </w:tcPr>
+          <w:p>
+            <w:r>
+              <w:rPr>
+                <w:b/>
+                <w:sz w:val="16"/>
+              </w:rPr>
+              <w:t>n</w:t>
+            </w:r>
+          </w:p>
+        </w:tc>
+        <w:tc>
+          <w:tcPr>
+            <w:tcW w:type="dxa" w:w="1721"/>
+          </w:tcPr>
+          <w:p>
+            <w:r>
+              <w:rPr>
+                <w:b/>
+                <w:sz w:val="16"/>
+              </w:rPr>
+              <w:t>Median</w:t>
+            </w:r>
+          </w:p>
+        </w:tc>
+        <w:tc>
+          <w:tcPr>
+            <w:tcW w:type="dxa" w:w="1721"/>
+          </w:tcPr>
+          <w:p>
+            <w:r>
+              <w:rPr>
+                <w:b/>
+                <w:sz w:val="16"/>
+              </w:rPr>
+              <w:t>P90</w:t>
+            </w:r>
+          </w:p>
+        </w:tc>
+        <w:tc>
+          <w:tcPr>
+            <w:tcW w:type="dxa" w:w="1721"/>
+          </w:tcPr>
+          <w:p>
+            <w:r>
+              <w:rPr>
+                <w:b/>
+                <w:sz w:val="16"/>
+              </w:rPr>
+              <w:t>Share &gt;=10</w:t>
+            </w:r>
+          </w:p>
+        </w:tc>
+        <w:tc>
+          <w:tcPr>
+            <w:tcW w:type="dxa" w:w="1721"/>
+          </w:tcPr>
+          <w:p>
+            <w:r>
+              <w:rPr>
+                <w:b/>
+                <w:sz w:val="16"/>
+              </w:rPr>
+              <w:t>Use in manuscript</w:t>
+            </w:r>
+          </w:p>
+        </w:tc>
+      </w:tr>
+      <w:tr>
+        <w:tc>
+          <w:tcPr>
+            <w:tcW w:type="dxa" w:w="1721"/>
+          </w:tcPr>
+          <w:p>
+            <w:r>
+              <w:rPr>
+                <w:sz w:val="16"/>
+              </w:rPr>
+              <w:t>DS3/DS1 repair cost</w:t>
+            </w:r>
+          </w:p>
+        </w:tc>
+        <w:tc>
+          <w:tcPr>
+            <w:tcW w:type="dxa" w:w="1721"/>
+          </w:tcPr>
+          <w:p>
+            <w:r>
+              <w:rPr>
+                <w:sz w:val="16"/>
+              </w:rPr>
+              <w:t>19</w:t>
+            </w:r>
+          </w:p>
+        </w:tc>
+        <w:tc>
+          <w:tcPr>
+            <w:tcW w:type="dxa" w:w="1721"/>
+          </w:tcPr>
+          <w:p>
+            <w:r>
+              <w:rPr>
+                <w:sz w:val="16"/>
+              </w:rPr>
+              <w:t>3.56</w:t>
+            </w:r>
+          </w:p>
+        </w:tc>
+        <w:tc>
+          <w:tcPr>
+            <w:tcW w:type="dxa" w:w="1721"/>
+          </w:tcPr>
+          <w:p>
+            <w:r>
+              <w:rPr>
+                <w:sz w:val="16"/>
+              </w:rPr>
+              <w:t>9.86</w:t>
+            </w:r>
+          </w:p>
+        </w:tc>
+        <w:tc>
+          <w:tcPr>
+            <w:tcW w:type="dxa" w:w="1721"/>
+          </w:tcPr>
+          <w:p>
+            <w:r>
+              <w:rPr>
+                <w:sz w:val="16"/>
+              </w:rPr>
+              <w:t>0.11</w:t>
+            </w:r>
+          </w:p>
+        </w:tc>
+        <w:tc>
+          <w:tcPr>
+            <w:tcW w:type="dxa" w:w="1721"/>
+          </w:tcPr>
+          <w:p>
+            <w:r>
+              <w:rPr>
+                <w:sz w:val="16"/>
+              </w:rPr>
+              <w:t>Supports FN:FP &gt; 1 plausibility</w:t>
+            </w:r>
+          </w:p>
+        </w:tc>
+      </w:tr>
+      <w:tr>
+        <w:tc>
+          <w:tcPr>
+            <w:tcW w:type="dxa" w:w="1721"/>
+          </w:tcPr>
+          <w:p>
+            <w:r>
+              <w:rPr>
+                <w:sz w:val="16"/>
+              </w:rPr>
+              <w:t>DS4/DS1 repair cost</w:t>
+            </w:r>
+          </w:p>
+        </w:tc>
+        <w:tc>
+          <w:tcPr>
+            <w:tcW w:type="dxa" w:w="1721"/>
+          </w:tcPr>
+          <w:p>
+            <w:r>
+              <w:rPr>
+                <w:sz w:val="16"/>
+              </w:rPr>
+              <w:t>3</w:t>
+            </w:r>
+          </w:p>
+        </w:tc>
+        <w:tc>
+          <w:tcPr>
+            <w:tcW w:type="dxa" w:w="1721"/>
+          </w:tcPr>
+          <w:p>
+            <w:r>
+              <w:rPr>
+                <w:sz w:val="16"/>
+              </w:rPr>
+              <w:t>10.34</w:t>
+            </w:r>
+          </w:p>
+        </w:tc>
+        <w:tc>
+          <w:tcPr>
+            <w:tcW w:type="dxa" w:w="1721"/>
+          </w:tcPr>
+          <w:p>
+            <w:r>
+              <w:rPr>
+                <w:sz w:val="16"/>
+              </w:rPr>
+              <w:t>43.48</w:t>
+            </w:r>
+          </w:p>
+        </w:tc>
+        <w:tc>
+          <w:tcPr>
+            <w:tcW w:type="dxa" w:w="1721"/>
+          </w:tcPr>
+          <w:p>
+            <w:r>
+              <w:rPr>
+                <w:sz w:val="16"/>
+              </w:rPr>
+              <w:t>0.67</w:t>
+            </w:r>
+          </w:p>
+        </w:tc>
+        <w:tc>
+          <w:tcPr>
+            <w:tcW w:type="dxa" w:w="1721"/>
+          </w:tcPr>
+          <w:p>
+            <w:r>
+              <w:rPr>
+                <w:sz w:val="16"/>
+              </w:rPr>
+              <w:t>Supports high-cost sensitivity exploration</w:t>
+            </w:r>
+          </w:p>
+        </w:tc>
+      </w:tr>
+      <w:tr>
+        <w:tc>
+          <w:tcPr>
+            <w:tcW w:type="dxa" w:w="1721"/>
+          </w:tcPr>
+          <w:p>
+            <w:r>
+              <w:rPr>
+                <w:sz w:val="16"/>
+              </w:rPr>
+              <w:t>DS3/DS1 repair time</w:t>
+            </w:r>
+          </w:p>
+        </w:tc>
+        <w:tc>
+          <w:tcPr>
+            <w:tcW w:type="dxa" w:w="1721"/>
+          </w:tcPr>
+          <w:p>
+            <w:r>
+              <w:rPr>
+                <w:sz w:val="16"/>
+              </w:rPr>
+              <w:t>19</w:t>
+            </w:r>
+          </w:p>
+        </w:tc>
+        <w:tc>
+          <w:tcPr>
+            <w:tcW w:type="dxa" w:w="1721"/>
+          </w:tcPr>
+          <w:p>
+            <w:r>
+              <w:rPr>
+                <w:sz w:val="16"/>
+              </w:rPr>
+              <w:t>3.11</w:t>
+            </w:r>
+          </w:p>
+        </w:tc>
+        <w:tc>
+          <w:tcPr>
+            <w:tcW w:type="dxa" w:w="1721"/>
+          </w:tcPr>
+          <w:p>
+            <w:r>
+              <w:rPr>
+                <w:sz w:val="16"/>
+              </w:rPr>
+              <w:t>7.97</w:t>
+            </w:r>
+          </w:p>
+        </w:tc>
+        <w:tc>
+          <w:tcPr>
+            <w:tcW w:type="dxa" w:w="1721"/>
+          </w:tcPr>
+          <w:p>
+            <w:r>
+              <w:rPr>
+                <w:sz w:val="16"/>
+              </w:rPr>
+              <w:t>0.05</w:t>
+            </w:r>
+          </w:p>
+        </w:tc>
+        <w:tc>
+          <w:tcPr>
+            <w:tcW w:type="dxa" w:w="1721"/>
+          </w:tcPr>
+          <w:p>
+            <w:r>
+              <w:rPr>
+                <w:sz w:val="16"/>
+              </w:rPr>
+              <w:t>Supports downtime-ratio plausibility</w:t>
+            </w:r>
+          </w:p>
+        </w:tc>
+      </w:tr>
+      <w:tr>
+        <w:tc>
+          <w:tcPr>
+            <w:tcW w:type="dxa" w:w="1721"/>
+          </w:tcPr>
+          <w:p>
+            <w:r>
+              <w:rPr>
+                <w:sz w:val="16"/>
+              </w:rPr>
+              <w:t>DS4/DS1 repair time</w:t>
+            </w:r>
+          </w:p>
+        </w:tc>
+        <w:tc>
+          <w:tcPr>
+            <w:tcW w:type="dxa" w:w="1721"/>
+          </w:tcPr>
+          <w:p>
+            <w:r>
+              <w:rPr>
+                <w:sz w:val="16"/>
+              </w:rPr>
+              <w:t>3</w:t>
+            </w:r>
+          </w:p>
+        </w:tc>
+        <w:tc>
+          <w:tcPr>
+            <w:tcW w:type="dxa" w:w="1721"/>
+          </w:tcPr>
+          <w:p>
+            <w:r>
+              <w:rPr>
+                <w:sz w:val="16"/>
+              </w:rPr>
+              <w:t>9.21</w:t>
+            </w:r>
+          </w:p>
+        </w:tc>
+        <w:tc>
+          <w:tcPr>
+            <w:tcW w:type="dxa" w:w="1721"/>
+          </w:tcPr>
+          <w:p>
+            <w:r>
+              <w:rPr>
+                <w:sz w:val="16"/>
+              </w:rPr>
+              <w:t>45.84</w:t>
+            </w:r>
+          </w:p>
+        </w:tc>
+        <w:tc>
+          <w:tcPr>
+            <w:tcW w:type="dxa" w:w="1721"/>
+          </w:tcPr>
+          <w:p>
+            <w:r>
+              <w:rPr>
+                <w:sz w:val="16"/>
+              </w:rPr>
+              <w:t>0.33</w:t>
+            </w:r>
+          </w:p>
+        </w:tc>
+        <w:tc>
+          <w:tcPr>
+            <w:tcW w:type="dxa" w:w="1721"/>
+          </w:tcPr>
+          <w:p>
+            <w:r>
+              <w:rPr>
+                <w:sz w:val="16"/>
+              </w:rPr>
+              <w:t>Supports high-cost sensitivity exploration</w:t>
+            </w:r>
+          </w:p>
+        </w:tc>
+      </w:tr>
+    </w:tbl>
+    <w:p>
+      <w:r>
+        <w:t>Claim boundary: this gate supports cost-ratio plausibility only. It must not be cited as direct Canterbury repair-cost prediction, design-consequence validation, or repair-cost calibration.</w:t>
       </w:r>
     </w:p>
     <w:sectPr>

</xml_diff>